<commit_message>
Clearer tutorial report title (Tutorial: Background GPS Route Tracking on Android)
</commit_message>
<xml_diff>
--- a/docs/TUTORIAL_REPORT.docx
+++ b/docs/TUTORIAL_REPORT.docx
@@ -2,13 +2,22 @@
 <file path=word/document.xml><?xml version="1.0" encoding="utf-8"?>
 <w:document xmlns:w="http://schemas.openxmlformats.org/wordprocessingml/2006/main" xmlns:m="http://schemas.openxmlformats.org/officeDocument/2006/math" xmlns:r="http://schemas.openxmlformats.org/officeDocument/2006/relationships" xmlns:o="urn:schemas-microsoft-com:office:office" xmlns:v="urn:schemas-microsoft-com:vml" xmlns:w10="urn:schemas-microsoft-com:office:word" xmlns:a="http://schemas.openxmlformats.org/drawingml/2006/main" xmlns:pic="http://schemas.openxmlformats.org/drawingml/2006/picture" xmlns:wp="http://schemas.openxmlformats.org/drawingml/2006/wordprocessingDrawing">
   <w:body>
-    <w:bookmarkStart w:id="46" w:name="X737d79c93eb7026712b3d2225c505796c30dc22"/>
+    <w:bookmarkStart w:id="47" w:name="Xc12940cea260618e4601e02a6cab5a6ca4feca5"/>
     <w:p>
       <w:pPr>
         <w:pStyle w:val="Heading1"/>
       </w:pPr>
       <w:r>
-        <w:t xml:space="preserve">Background GPS Route Tracking in Jetpack Compose with FusedLocationProviderClient and a Foreground Service</w:t>
+        <w:t xml:space="preserve">Tutorial: Background GPS Route Tracking on Android</w:t>
+      </w:r>
+    </w:p>
+    <w:bookmarkStart w:id="21" w:name="X7ba990d884bb74e15f9f285dd3d02f768af7cb1"/>
+    <w:p>
+      <w:pPr>
+        <w:pStyle w:val="Heading3"/>
+      </w:pPr>
+      <w:r>
+        <w:t xml:space="preserve">Using FusedLocationProviderClient with a Foreground Service in Jetpack Compose</w:t>
       </w:r>
     </w:p>
     <w:p>
@@ -20,7 +29,7 @@
           <w:b/>
           <w:bCs/>
         </w:rPr>
-        <w:t xml:space="preserve">A CS5520 Final Tutorial Report</w:t>
+        <w:t xml:space="preserve">CS5520 Final Tutorial Report</w:t>
       </w:r>
       <w:r>
         <w:t xml:space="preserve"> </w:t>
@@ -89,7 +98,8 @@
         </w:pict>
       </w:r>
     </w:p>
-    <w:bookmarkStart w:id="21" w:name="introduction"/>
+    <w:bookmarkEnd w:id="21"/>
+    <w:bookmarkStart w:id="22" w:name="introduction"/>
     <w:p>
       <w:pPr>
         <w:pStyle w:val="Heading2"/>
@@ -299,8 +309,8 @@
         </w:pict>
       </w:r>
     </w:p>
-    <w:bookmarkEnd w:id="21"/>
-    <w:bookmarkStart w:id="22" w:name="X028de10d0b8864815e31876e7aabe27d1375088"/>
+    <w:bookmarkEnd w:id="22"/>
+    <w:bookmarkStart w:id="23" w:name="X028de10d0b8864815e31876e7aabe27d1375088"/>
     <w:p>
       <w:pPr>
         <w:pStyle w:val="Heading2"/>
@@ -767,8 +777,8 @@
         </w:pict>
       </w:r>
     </w:p>
-    <w:bookmarkEnd w:id="22"/>
-    <w:bookmarkStart w:id="23" w:name="background-the-two-apis"/>
+    <w:bookmarkEnd w:id="23"/>
+    <w:bookmarkStart w:id="24" w:name="background-the-two-apis"/>
     <w:p>
       <w:pPr>
         <w:pStyle w:val="Heading2"/>
@@ -964,8 +974,8 @@
         </w:pict>
       </w:r>
     </w:p>
-    <w:bookmarkEnd w:id="23"/>
-    <w:bookmarkStart w:id="24" w:name="prerequisites"/>
+    <w:bookmarkEnd w:id="24"/>
+    <w:bookmarkStart w:id="25" w:name="prerequisites"/>
     <w:p>
       <w:pPr>
         <w:pStyle w:val="Heading2"/>
@@ -1058,8 +1068,8 @@
         </w:pict>
       </w:r>
     </w:p>
-    <w:bookmarkEnd w:id="24"/>
-    <w:bookmarkStart w:id="36" w:name="step-by-step-implementation"/>
+    <w:bookmarkEnd w:id="25"/>
+    <w:bookmarkStart w:id="37" w:name="step-by-step-implementation"/>
     <w:p>
       <w:pPr>
         <w:pStyle w:val="Heading2"/>
@@ -1068,7 +1078,7 @@
         <w:t xml:space="preserve">5. Step-by-step implementation</w:t>
       </w:r>
     </w:p>
-    <w:bookmarkStart w:id="25" w:name="add-the-dependency"/>
+    <w:bookmarkStart w:id="26" w:name="add-the-dependency"/>
     <w:p>
       <w:pPr>
         <w:pStyle w:val="Heading3"/>
@@ -1378,8 +1388,8 @@
         <w:t xml:space="preserve">)</w:t>
       </w:r>
     </w:p>
-    <w:bookmarkEnd w:id="25"/>
-    <w:bookmarkStart w:id="26" w:name="X92e8b132444f8f997adf2975c4f675bbaabad55"/>
+    <w:bookmarkEnd w:id="26"/>
+    <w:bookmarkStart w:id="27" w:name="X92e8b132444f8f997adf2975c4f675bbaabad55"/>
     <w:p>
       <w:pPr>
         <w:pStyle w:val="Heading3"/>
@@ -1752,8 +1762,8 @@
         <w:t xml:space="preserve">14+ for a location-typed foreground service.</w:t>
       </w:r>
     </w:p>
-    <w:bookmarkEnd w:id="26"/>
-    <w:bookmarkStart w:id="27" w:name="model-a-single-gps-sample"/>
+    <w:bookmarkEnd w:id="27"/>
+    <w:bookmarkStart w:id="28" w:name="model-a-single-gps-sample"/>
     <w:p>
       <w:pPr>
         <w:pStyle w:val="Heading3"/>
@@ -1968,8 +1978,8 @@
         <w:t xml:space="preserve">)</w:t>
       </w:r>
     </w:p>
-    <w:bookmarkEnd w:id="27"/>
-    <w:bookmarkStart w:id="28" w:name="a-process-wide-source-of-truth-stateflow"/>
+    <w:bookmarkEnd w:id="28"/>
+    <w:bookmarkStart w:id="29" w:name="a-process-wide-source-of-truth-stateflow"/>
     <w:p>
       <w:pPr>
         <w:pStyle w:val="Heading3"/>
@@ -3695,8 +3705,8 @@
         <w:t xml:space="preserve">}</w:t>
       </w:r>
     </w:p>
-    <w:bookmarkEnd w:id="28"/>
-    <w:bookmarkStart w:id="29" w:name="the-foreground-service"/>
+    <w:bookmarkEnd w:id="29"/>
+    <w:bookmarkStart w:id="30" w:name="the-foreground-service"/>
     <w:p>
       <w:pPr>
         <w:pStyle w:val="Heading3"/>
@@ -6196,8 +6206,8 @@
         <w:t xml:space="preserve">}</w:t>
       </w:r>
     </w:p>
-    <w:bookmarkEnd w:id="29"/>
-    <w:bookmarkStart w:id="33" w:name="X9cce91507e0758de0a8f3013fc9936fe54d72c2"/>
+    <w:bookmarkEnd w:id="30"/>
+    <w:bookmarkStart w:id="34" w:name="X9cce91507e0758de0a8f3013fc9936fe54d72c2"/>
     <w:p>
       <w:pPr>
         <w:pStyle w:val="Heading3"/>
@@ -6834,18 +6844,18 @@
           <wp:inline>
             <wp:extent cx="5334000" cy="11853333"/>
             <wp:effectExtent b="0" l="0" r="0" t="0"/>
-            <wp:docPr descr="Location permission rationale screen" title="" id="31" name="Picture"/>
+            <wp:docPr descr="Location permission rationale screen" title="" id="32" name="Picture"/>
             <a:graphic>
               <a:graphicData uri="http://schemas.openxmlformats.org/drawingml/2006/picture">
                 <pic:pic>
                   <pic:nvPicPr>
-                    <pic:cNvPr descr="images/01_location_permission.png" id="32" name="Picture"/>
+                    <pic:cNvPr descr="images/01_location_permission.png" id="33" name="Picture"/>
                     <pic:cNvPicPr>
                       <a:picLocks noChangeArrowheads="1" noChangeAspect="1"/>
                     </pic:cNvPicPr>
                   </pic:nvPicPr>
                   <pic:blipFill>
-                    <a:blip r:embed="rId30"/>
+                    <a:blip r:embed="rId31"/>
                     <a:stretch>
                       <a:fillRect/>
                     </a:stretch>
@@ -6880,8 +6890,8 @@
         <w:t xml:space="preserve">Location permission rationale screen</w:t>
       </w:r>
     </w:p>
-    <w:bookmarkEnd w:id="33"/>
-    <w:bookmarkStart w:id="34" w:name="startstop-the-service-from-a-viewmodel"/>
+    <w:bookmarkEnd w:id="34"/>
+    <w:bookmarkStart w:id="35" w:name="startstop-the-service-from-a-viewmodel"/>
     <w:p>
       <w:pPr>
         <w:pStyle w:val="Heading3"/>
@@ -7899,8 +7909,8 @@
         <w:t xml:space="preserve">}</w:t>
       </w:r>
     </w:p>
-    <w:bookmarkEnd w:id="34"/>
-    <w:bookmarkStart w:id="35" w:name="Xbebe6a58db700678029c1f395052c8767503af5"/>
+    <w:bookmarkEnd w:id="35"/>
+    <w:bookmarkStart w:id="36" w:name="Xbebe6a58db700678029c1f395052c8767503af5"/>
     <w:p>
       <w:pPr>
         <w:pStyle w:val="Heading3"/>
@@ -9581,9 +9591,9 @@
         </w:pict>
       </w:r>
     </w:p>
-    <w:bookmarkEnd w:id="35"/>
     <w:bookmarkEnd w:id="36"/>
-    <w:bookmarkStart w:id="43" w:name="running-it"/>
+    <w:bookmarkEnd w:id="37"/>
+    <w:bookmarkStart w:id="44" w:name="running-it"/>
     <w:p>
       <w:pPr>
         <w:pStyle w:val="Heading2"/>
@@ -9716,18 +9726,18 @@
                 <wp:inline>
                   <wp:extent cx="5334000" cy="11853333"/>
                   <wp:effectExtent b="0" l="0" r="0" t="0"/>
-                  <wp:docPr descr="Active trip" title="" id="38" name="Picture"/>
+                  <wp:docPr descr="Active trip" title="" id="39" name="Picture"/>
                   <a:graphic>
                     <a:graphicData uri="http://schemas.openxmlformats.org/drawingml/2006/picture">
                       <pic:pic>
                         <pic:nvPicPr>
-                          <pic:cNvPr descr="images/02_active_trip.png" id="39" name="Picture"/>
+                          <pic:cNvPr descr="images/02_active_trip.png" id="40" name="Picture"/>
                           <pic:cNvPicPr>
                             <a:picLocks noChangeArrowheads="1" noChangeAspect="1"/>
                           </pic:cNvPicPr>
                         </pic:nvPicPr>
                         <pic:blipFill>
-                          <a:blip r:embed="rId37"/>
+                          <a:blip r:embed="rId38"/>
                           <a:stretch>
                             <a:fillRect/>
                           </a:stretch>
@@ -9766,18 +9776,18 @@
                 <wp:inline>
                   <wp:extent cx="5334000" cy="11853333"/>
                   <wp:effectExtent b="0" l="0" r="0" t="0"/>
-                  <wp:docPr descr="Trip summary" title="" id="41" name="Picture"/>
+                  <wp:docPr descr="Trip summary" title="" id="42" name="Picture"/>
                   <a:graphic>
                     <a:graphicData uri="http://schemas.openxmlformats.org/drawingml/2006/picture">
                       <pic:pic>
                         <pic:nvPicPr>
-                          <pic:cNvPr descr="images/03_trip_summary.png" id="42" name="Picture"/>
+                          <pic:cNvPr descr="images/03_trip_summary.png" id="43" name="Picture"/>
                           <pic:cNvPicPr>
                             <a:picLocks noChangeArrowheads="1" noChangeAspect="1"/>
                           </pic:cNvPicPr>
                         </pic:nvPicPr>
                         <pic:blipFill>
-                          <a:blip r:embed="rId40"/>
+                          <a:blip r:embed="rId41"/>
                           <a:stretch>
                             <a:fillRect/>
                           </a:stretch>
@@ -9814,8 +9824,8 @@
         </w:pict>
       </w:r>
     </w:p>
-    <w:bookmarkEnd w:id="43"/>
-    <w:bookmarkStart w:id="44" w:name="reference-code-a-fully-working-app"/>
+    <w:bookmarkEnd w:id="44"/>
+    <w:bookmarkStart w:id="45" w:name="reference-code-a-fully-working-app"/>
     <w:p>
       <w:pPr>
         <w:pStyle w:val="Heading2"/>
@@ -10176,8 +10186,8 @@
         </w:pict>
       </w:r>
     </w:p>
-    <w:bookmarkEnd w:id="44"/>
-    <w:bookmarkStart w:id="45" w:name="conclusion"/>
+    <w:bookmarkEnd w:id="45"/>
+    <w:bookmarkStart w:id="46" w:name="conclusion"/>
     <w:p>
       <w:pPr>
         <w:pStyle w:val="Heading2"/>
@@ -10315,8 +10325,8 @@
         <w:t xml:space="preserve">“where did the user actually go?”</w:t>
       </w:r>
     </w:p>
-    <w:bookmarkEnd w:id="45"/>
     <w:bookmarkEnd w:id="46"/>
+    <w:bookmarkEnd w:id="47"/>
     <w:sectPr>
       <w:footnotePr>
         <w:numRestart w:val="eachSect"/>

</xml_diff>

<commit_message>
Use plainer report title; expand intro to explain the utility
Title -> 'Tutorial: Recording GPS Routes in the Background on Android'.
Add a 'What is this utility, exactly?' subsection introducing
FusedLocationProviderClient and Foreground Services and why they're paired.
</commit_message>
<xml_diff>
--- a/docs/TUTORIAL_REPORT.docx
+++ b/docs/TUTORIAL_REPORT.docx
@@ -2,22 +2,13 @@
 <file path=word/document.xml><?xml version="1.0" encoding="utf-8"?>
 <w:document xmlns:w="http://schemas.openxmlformats.org/wordprocessingml/2006/main" xmlns:m="http://schemas.openxmlformats.org/officeDocument/2006/math" xmlns:r="http://schemas.openxmlformats.org/officeDocument/2006/relationships" xmlns:o="urn:schemas-microsoft-com:office:office" xmlns:v="urn:schemas-microsoft-com:vml" xmlns:w10="urn:schemas-microsoft-com:office:word" xmlns:a="http://schemas.openxmlformats.org/drawingml/2006/main" xmlns:pic="http://schemas.openxmlformats.org/drawingml/2006/picture" xmlns:wp="http://schemas.openxmlformats.org/drawingml/2006/wordprocessingDrawing">
   <w:body>
-    <w:bookmarkStart w:id="47" w:name="Xc12940cea260618e4601e02a6cab5a6ca4feca5"/>
+    <w:bookmarkStart w:id="47" w:name="X043aa051d9565ed0255a30fac4cdd31102ef8c0"/>
     <w:p>
       <w:pPr>
         <w:pStyle w:val="Heading1"/>
       </w:pPr>
       <w:r>
-        <w:t xml:space="preserve">Tutorial: Background GPS Route Tracking on Android</w:t>
-      </w:r>
-    </w:p>
-    <w:bookmarkStart w:id="21" w:name="X7ba990d884bb74e15f9f285dd3d02f768af7cb1"/>
-    <w:p>
-      <w:pPr>
-        <w:pStyle w:val="Heading3"/>
-      </w:pPr>
-      <w:r>
-        <w:t xml:space="preserve">Using FusedLocationProviderClient with a Foreground Service in Jetpack Compose</w:t>
+        <w:t xml:space="preserve">Tutorial: Recording GPS Routes in the Background on Android</w:t>
       </w:r>
     </w:p>
     <w:p>
@@ -98,7 +89,6 @@
         </w:pict>
       </w:r>
     </w:p>
-    <w:bookmarkEnd w:id="21"/>
     <w:bookmarkStart w:id="22" w:name="introduction"/>
     <w:p>
       <w:pPr>
@@ -201,37 +191,32 @@
         <w:t xml:space="preserve">navigating in Google Maps), with a persistent notification telling the user recording is active.</w:t>
       </w:r>
     </w:p>
+    <w:bookmarkStart w:id="21" w:name="what-is-this-utility-exactly"/>
+    <w:p>
+      <w:pPr>
+        <w:pStyle w:val="Heading3"/>
+      </w:pPr>
+      <w:r>
+        <w:t xml:space="preserve">What is this utility, exactly?</w:t>
+      </w:r>
+    </w:p>
     <w:p>
       <w:pPr>
         <w:pStyle w:val="FirstParagraph"/>
       </w:pPr>
       <w:r>
-        <w:t xml:space="preserve">This report is a step-by-step tutorial for building exactly that: a feature that, on</w:t>
-      </w:r>
-      <w:r>
-        <w:t xml:space="preserve"> </w:t>
-      </w:r>
-      <w:r>
-        <w:rPr>
+        <w:rPr>
+          <w:rStyle w:val="VerbatimChar"/>
           <w:b/>
           <w:bCs/>
         </w:rPr>
-        <w:t xml:space="preserve">Start Trip</w:t>
-      </w:r>
-      <w:r>
-        <w:t xml:space="preserve">,</w:t>
-      </w:r>
-      <w:r>
-        <w:t xml:space="preserve"> </w:t>
-      </w:r>
-      <w:r>
-        <w:t xml:space="preserve">begins logging the device’s GPS path in the background, draws the route live, and saves it when the</w:t>
-      </w:r>
-      <w:r>
-        <w:t xml:space="preserve"> </w:t>
-      </w:r>
-      <w:r>
-        <w:t xml:space="preserve">user taps</w:t>
+        <w:t xml:space="preserve">FusedLocationProviderClient</w:t>
+      </w:r>
+      <w:r>
+        <w:t xml:space="preserve"> </w:t>
+      </w:r>
+      <w:r>
+        <w:t xml:space="preserve">is the location client from the</w:t>
       </w:r>
       <w:r>
         <w:t xml:space="preserve"> </w:t>
@@ -241,29 +226,80 @@
           <w:b/>
           <w:bCs/>
         </w:rPr>
-        <w:t xml:space="preserve">Stop Trip</w:t>
-      </w:r>
-      <w:r>
-        <w:t xml:space="preserve">. The working reference is</w:t>
-      </w:r>
-      <w:r>
-        <w:t xml:space="preserve"> </w:t>
-      </w:r>
-      <w:r>
-        <w:rPr>
-          <w:b/>
-          <w:bCs/>
-        </w:rPr>
-        <w:t xml:space="preserve">Roamly</w:t>
-      </w:r>
-      <w:r>
-        <w:t xml:space="preserve">, a travel app where contributing your own</w:t>
-      </w:r>
-      <w:r>
-        <w:t xml:space="preserve"> </w:t>
-      </w:r>
-      <w:r>
-        <w:t xml:space="preserve">recorded routes unlocks recommendations from other travelers.</w:t>
+        <w:t xml:space="preserve">Google Play Services Location</w:t>
+      </w:r>
+      <w:r>
+        <w:t xml:space="preserve"> </w:t>
+      </w:r>
+      <w:r>
+        <w:t xml:space="preserve">library (</w:t>
+      </w:r>
+      <w:r>
+        <w:rPr>
+          <w:rStyle w:val="VerbatimChar"/>
+        </w:rPr>
+        <w:t xml:space="preserve">com.google.android.gms:play-services-location</w:t>
+      </w:r>
+      <w:r>
+        <w:t xml:space="preserve">). It is called</w:t>
+      </w:r>
+      <w:r>
+        <w:t xml:space="preserve"> </w:t>
+      </w:r>
+      <w:r>
+        <w:rPr>
+          <w:i/>
+          <w:iCs/>
+        </w:rPr>
+        <w:t xml:space="preserve">fused</w:t>
+      </w:r>
+      <w:r>
+        <w:t xml:space="preserve"> </w:t>
+      </w:r>
+      <w:r>
+        <w:t xml:space="preserve">because it</w:t>
+      </w:r>
+      <w:r>
+        <w:t xml:space="preserve"> </w:t>
+      </w:r>
+      <w:r>
+        <w:t xml:space="preserve">transparently blends GPS, Wi-Fi, cell-tower, and motion-sensor signals into a single, smoothed</w:t>
+      </w:r>
+      <w:r>
+        <w:t xml:space="preserve"> </w:t>
+      </w:r>
+      <w:r>
+        <w:t xml:space="preserve">location stream, and it lets you trade accuracy against battery through a declarative</w:t>
+      </w:r>
+      <w:r>
+        <w:t xml:space="preserve"> </w:t>
+      </w:r>
+      <w:r>
+        <w:rPr>
+          <w:rStyle w:val="VerbatimChar"/>
+        </w:rPr>
+        <w:t xml:space="preserve">LocationRequest</w:t>
+      </w:r>
+      <w:r>
+        <w:t xml:space="preserve"> </w:t>
+      </w:r>
+      <w:r>
+        <w:t xml:space="preserve">(update interval, priority, and minimum distance). It replaces the older</w:t>
+      </w:r>
+      <w:r>
+        <w:t xml:space="preserve"> </w:t>
+      </w:r>
+      <w:r>
+        <w:rPr>
+          <w:rStyle w:val="VerbatimChar"/>
+        </w:rPr>
+        <w:t xml:space="preserve">android.location.LocationManager</w:t>
+      </w:r>
+      <w:r>
+        <w:t xml:space="preserve"> </w:t>
+      </w:r>
+      <w:r>
+        <w:t xml:space="preserve">and is the approach Google recommends for almost all apps.</w:t>
       </w:r>
     </w:p>
     <w:p>
@@ -271,6 +307,230 @@
         <w:pStyle w:val="BodyText"/>
       </w:pPr>
       <w:r>
+        <w:t xml:space="preserve">A</w:t>
+      </w:r>
+      <w:r>
+        <w:t xml:space="preserve"> </w:t>
+      </w:r>
+      <w:r>
+        <w:rPr>
+          <w:b/>
+          <w:bCs/>
+        </w:rPr>
+        <w:t xml:space="preserve">Foreground Service</w:t>
+      </w:r>
+      <w:r>
+        <w:t xml:space="preserve"> </w:t>
+      </w:r>
+      <w:r>
+        <w:t xml:space="preserve">is a long-running Android</w:t>
+      </w:r>
+      <w:r>
+        <w:t xml:space="preserve"> </w:t>
+      </w:r>
+      <w:r>
+        <w:rPr>
+          <w:rStyle w:val="VerbatimChar"/>
+        </w:rPr>
+        <w:t xml:space="preserve">Service</w:t>
+      </w:r>
+      <w:r>
+        <w:t xml:space="preserve"> </w:t>
+      </w:r>
+      <w:r>
+        <w:t xml:space="preserve">that the operating system keeps alive</w:t>
+      </w:r>
+      <w:r>
+        <w:t xml:space="preserve"> </w:t>
+      </w:r>
+      <w:r>
+        <w:rPr>
+          <w:i/>
+          <w:iCs/>
+        </w:rPr>
+        <w:t xml:space="preserve">because</w:t>
+      </w:r>
+      <w:r>
+        <w:t xml:space="preserve"> </w:t>
+      </w:r>
+      <w:r>
+        <w:t xml:space="preserve">it continuously shows the user an ongoing notification. It is the officially supported way</w:t>
+      </w:r>
+      <w:r>
+        <w:t xml:space="preserve"> </w:t>
+      </w:r>
+      <w:r>
+        <w:t xml:space="preserve">to run user-visible work — such as location logging, music playback, or navigation — when your app is</w:t>
+      </w:r>
+      <w:r>
+        <w:t xml:space="preserve"> </w:t>
+      </w:r>
+      <w:r>
+        <w:t xml:space="preserve">not on screen.</w:t>
+      </w:r>
+    </w:p>
+    <w:p>
+      <w:pPr>
+        <w:pStyle w:val="BodyText"/>
+      </w:pPr>
+      <w:r>
+        <w:t xml:space="preserve">Why both are needed</w:t>
+      </w:r>
+      <w:r>
+        <w:t xml:space="preserve"> </w:t>
+      </w:r>
+      <w:r>
+        <w:rPr>
+          <w:i/>
+          <w:iCs/>
+        </w:rPr>
+        <w:t xml:space="preserve">together</w:t>
+      </w:r>
+      <w:r>
+        <w:t xml:space="preserve">: on its own,</w:t>
+      </w:r>
+      <w:r>
+        <w:t xml:space="preserve"> </w:t>
+      </w:r>
+      <w:r>
+        <w:rPr>
+          <w:rStyle w:val="VerbatimChar"/>
+        </w:rPr>
+        <w:t xml:space="preserve">FusedLocationProviderClient</w:t>
+      </w:r>
+      <w:r>
+        <w:t xml:space="preserve"> </w:t>
+      </w:r>
+      <w:r>
+        <w:t xml:space="preserve">stops delivering updates</w:t>
+      </w:r>
+      <w:r>
+        <w:t xml:space="preserve"> </w:t>
+      </w:r>
+      <w:r>
+        <w:t xml:space="preserve">once your app is backgrounded (and modern Android increasingly restricts background location). Hosting</w:t>
+      </w:r>
+      <w:r>
+        <w:t xml:space="preserve"> </w:t>
+      </w:r>
+      <w:r>
+        <w:t xml:space="preserve">the location client</w:t>
+      </w:r>
+      <w:r>
+        <w:t xml:space="preserve"> </w:t>
+      </w:r>
+      <w:r>
+        <w:rPr>
+          <w:b/>
+          <w:bCs/>
+        </w:rPr>
+        <w:t xml:space="preserve">inside a Foreground Service</w:t>
+      </w:r>
+      <w:r>
+        <w:t xml:space="preserve"> </w:t>
+      </w:r>
+      <w:r>
+        <w:t xml:space="preserve">is what makes continuous,</w:t>
+      </w:r>
+      <w:r>
+        <w:t xml:space="preserve"> </w:t>
+      </w:r>
+      <w:r>
+        <w:rPr>
+          <w:i/>
+          <w:iCs/>
+        </w:rPr>
+        <w:t xml:space="preserve">background</w:t>
+      </w:r>
+      <w:r>
+        <w:t xml:space="preserve"> </w:t>
+      </w:r>
+      <w:r>
+        <w:t xml:space="preserve">route</w:t>
+      </w:r>
+      <w:r>
+        <w:t xml:space="preserve"> </w:t>
+      </w:r>
+      <w:r>
+        <w:t xml:space="preserve">recording reliable and policy-compliant. That pairing — a fused location stream driven from a</w:t>
+      </w:r>
+      <w:r>
+        <w:t xml:space="preserve"> </w:t>
+      </w:r>
+      <w:r>
+        <w:t xml:space="preserve">foreground service, surfaced to Jetpack Compose — is the utility this tutorial teaches.</w:t>
+      </w:r>
+    </w:p>
+    <w:p>
+      <w:pPr>
+        <w:pStyle w:val="BodyText"/>
+      </w:pPr>
+      <w:r>
+        <w:t xml:space="preserve">This report is a step-by-step tutorial for building exactly that: a feature that, on</w:t>
+      </w:r>
+      <w:r>
+        <w:t xml:space="preserve"> </w:t>
+      </w:r>
+      <w:r>
+        <w:rPr>
+          <w:b/>
+          <w:bCs/>
+        </w:rPr>
+        <w:t xml:space="preserve">Start Trip</w:t>
+      </w:r>
+      <w:r>
+        <w:t xml:space="preserve">,</w:t>
+      </w:r>
+      <w:r>
+        <w:t xml:space="preserve"> </w:t>
+      </w:r>
+      <w:r>
+        <w:t xml:space="preserve">begins logging the device’s GPS path in the background, draws the route live, and saves it when the</w:t>
+      </w:r>
+      <w:r>
+        <w:t xml:space="preserve"> </w:t>
+      </w:r>
+      <w:r>
+        <w:t xml:space="preserve">user taps</w:t>
+      </w:r>
+      <w:r>
+        <w:t xml:space="preserve"> </w:t>
+      </w:r>
+      <w:r>
+        <w:rPr>
+          <w:b/>
+          <w:bCs/>
+        </w:rPr>
+        <w:t xml:space="preserve">Stop Trip</w:t>
+      </w:r>
+      <w:r>
+        <w:t xml:space="preserve">. The working reference is</w:t>
+      </w:r>
+      <w:r>
+        <w:t xml:space="preserve"> </w:t>
+      </w:r>
+      <w:r>
+        <w:rPr>
+          <w:b/>
+          <w:bCs/>
+        </w:rPr>
+        <w:t xml:space="preserve">Roamly</w:t>
+      </w:r>
+      <w:r>
+        <w:t xml:space="preserve">, a travel app where contributing your own</w:t>
+      </w:r>
+      <w:r>
+        <w:t xml:space="preserve"> </w:t>
+      </w:r>
+      <w:r>
+        <w:t xml:space="preserve">recorded routes unlocks recommendations from other travelers.</w:t>
+      </w:r>
+    </w:p>
+    <w:p>
+      <w:pPr>
+        <w:pStyle w:val="BodyText"/>
+      </w:pPr>
+      <w:r>
         <w:t xml:space="preserve">The report is organized as: why this utility is</w:t>
       </w:r>
       <w:r>
@@ -309,6 +569,7 @@
         </w:pict>
       </w:r>
     </w:p>
+    <w:bookmarkEnd w:id="21"/>
     <w:bookmarkEnd w:id="22"/>
     <w:bookmarkStart w:id="23" w:name="X028de10d0b8864815e31876e7aabe27d1375088"/>
     <w:p>

</xml_diff>

<commit_message>
Note Canvas-vs-Google-Maps design choice at the screenshots
Explain that the route is drawn on a Compose Canvas (not Google Maps) to
avoid Maps API key + billing, that the recorded GPS data is identical, and
that production would render the same points as a Google Maps Polyline.
</commit_message>
<xml_diff>
--- a/docs/TUTORIAL_REPORT.docx
+++ b/docs/TUTORIAL_REPORT.docx
@@ -10078,6 +10078,166 @@
         </w:tc>
       </w:tr>
     </w:tbl>
+    <w:p>
+      <w:pPr>
+        <w:pStyle w:val="BlockText"/>
+      </w:pPr>
+      <w:r>
+        <w:rPr>
+          <w:b/>
+          <w:bCs/>
+        </w:rPr>
+        <w:t xml:space="preserve">Note on the map visuals.</w:t>
+      </w:r>
+      <w:r>
+        <w:t xml:space="preserve"> </w:t>
+      </w:r>
+      <w:r>
+        <w:t xml:space="preserve">The route in these screenshots is rendered on a</w:t>
+      </w:r>
+      <w:r>
+        <w:t xml:space="preserve"> </w:t>
+      </w:r>
+      <w:r>
+        <w:rPr>
+          <w:b/>
+          <w:bCs/>
+        </w:rPr>
+        <w:t xml:space="preserve">Compose</w:t>
+      </w:r>
+      <w:r>
+        <w:rPr>
+          <w:b/>
+          <w:bCs/>
+        </w:rPr>
+        <w:t xml:space="preserve"> </w:t>
+      </w:r>
+      <w:r>
+        <w:rPr>
+          <w:rStyle w:val="VerbatimChar"/>
+          <w:b/>
+          <w:bCs/>
+        </w:rPr>
+        <w:t xml:space="preserve">Canvas</w:t>
+      </w:r>
+      <w:r>
+        <w:t xml:space="preserve">,</w:t>
+      </w:r>
+      <w:r>
+        <w:t xml:space="preserve"> </w:t>
+      </w:r>
+      <w:r>
+        <w:t xml:space="preserve">not on a Google Map. This is a deliberate choice: the Google Maps SDK requires a Google Cloud API</w:t>
+      </w:r>
+      <w:r>
+        <w:t xml:space="preserve"> </w:t>
+      </w:r>
+      <w:r>
+        <w:t xml:space="preserve">key and an attached</w:t>
+      </w:r>
+      <w:r>
+        <w:t xml:space="preserve"> </w:t>
+      </w:r>
+      <w:r>
+        <w:rPr>
+          <w:b/>
+          <w:bCs/>
+        </w:rPr>
+        <w:t xml:space="preserve">billing account</w:t>
+      </w:r>
+      <w:r>
+        <w:t xml:space="preserve"> </w:t>
+      </w:r>
+      <w:r>
+        <w:t xml:space="preserve">(Maps usage is billed even within its free monthly credit),</w:t>
+      </w:r>
+      <w:r>
+        <w:t xml:space="preserve"> </w:t>
+      </w:r>
+      <w:r>
+        <w:t xml:space="preserve">which this project avoids to stay entirely on free tiers. The tutorial’s actual subject — the</w:t>
+      </w:r>
+      <w:r>
+        <w:t xml:space="preserve"> </w:t>
+      </w:r>
+      <w:r>
+        <w:t xml:space="preserve">Foreground Service capturing GPS fixes with</w:t>
+      </w:r>
+      <w:r>
+        <w:t xml:space="preserve"> </w:t>
+      </w:r>
+      <w:r>
+        <w:rPr>
+          <w:rStyle w:val="VerbatimChar"/>
+        </w:rPr>
+        <w:t xml:space="preserve">FusedLocationProviderClient</w:t>
+      </w:r>
+      <w:r>
+        <w:t xml:space="preserve"> </w:t>
+      </w:r>
+      <w:r>
+        <w:t xml:space="preserve">— is unchanged by this</w:t>
+      </w:r>
+      <w:r>
+        <w:t xml:space="preserve"> </w:t>
+      </w:r>
+      <w:r>
+        <w:t xml:space="preserve">choice: it records the</w:t>
+      </w:r>
+      <w:r>
+        <w:t xml:space="preserve"> </w:t>
+      </w:r>
+      <w:r>
+        <w:rPr>
+          <w:b/>
+          <w:bCs/>
+        </w:rPr>
+        <w:t xml:space="preserve">same latitude/longitude points</w:t>
+      </w:r>
+      <w:r>
+        <w:t xml:space="preserve"> </w:t>
+      </w:r>
+      <w:r>
+        <w:t xml:space="preserve">regardless of how they’re displayed. In a</w:t>
+      </w:r>
+      <w:r>
+        <w:t xml:space="preserve"> </w:t>
+      </w:r>
+      <w:r>
+        <w:t xml:space="preserve">production build you would keep all of this code as-is and simply render the recorded points as a</w:t>
+      </w:r>
+      <w:r>
+        <w:t xml:space="preserve"> </w:t>
+      </w:r>
+      <w:r>
+        <w:rPr>
+          <w:b/>
+          <w:bCs/>
+        </w:rPr>
+        <w:t xml:space="preserve">Google Maps</w:t>
+      </w:r>
+      <w:r>
+        <w:rPr>
+          <w:b/>
+          <w:bCs/>
+        </w:rPr>
+        <w:t xml:space="preserve"> </w:t>
+      </w:r>
+      <w:r>
+        <w:rPr>
+          <w:rStyle w:val="VerbatimChar"/>
+          <w:b/>
+          <w:bCs/>
+        </w:rPr>
+        <w:t xml:space="preserve">Polyline</w:t>
+      </w:r>
+      <w:r>
+        <w:t xml:space="preserve"> </w:t>
+      </w:r>
+      <w:r>
+        <w:t xml:space="preserve">on a real basemap (streets, labels, satellite) instead of the Canvas.</w:t>
+      </w:r>
+    </w:p>
     <w:p>
       <w:r>
         <w:pict>

</xml_diff>

<commit_message>
Make tutorial report read more naturally; cut excessive bold
Rework intro/background/conclusion and the map-visuals note into a looser,
first-person voice, and remove emphasis bolding except the title block.
</commit_message>
<xml_diff>
--- a/docs/TUTORIAL_REPORT.docx
+++ b/docs/TUTORIAL_REPORT.docx
@@ -103,7 +103,51 @@
         <w:pStyle w:val="FirstParagraph"/>
       </w:pPr>
       <w:r>
-        <w:t xml:space="preserve">Many mobile apps need to record</w:t>
+        <w:t xml:space="preserve">A lot of apps really just need to answer one question: where did the user actually go? Fitness</w:t>
+      </w:r>
+      <w:r>
+        <w:t xml:space="preserve"> </w:t>
+      </w:r>
+      <w:r>
+        <w:t xml:space="preserve">trackers, food-delivery apps, navigation, travel apps — they all record a GPS trail. I ran into this</w:t>
+      </w:r>
+      <w:r>
+        <w:t xml:space="preserve"> </w:t>
+      </w:r>
+      <w:r>
+        <w:t xml:space="preserve">building Roamly, a travel app where you</w:t>
+      </w:r>
+      <w:r>
+        <w:t xml:space="preserve"> </w:t>
+      </w:r>
+      <w:r>
+        <w:t xml:space="preserve">“contribute”</w:t>
+      </w:r>
+      <w:r>
+        <w:t xml:space="preserve"> </w:t>
+      </w:r>
+      <w:r>
+        <w:t xml:space="preserve">the routes you walk to unlock recommendations</w:t>
+      </w:r>
+      <w:r>
+        <w:t xml:space="preserve"> </w:t>
+      </w:r>
+      <w:r>
+        <w:t xml:space="preserve">from other travelers. Recording an accurate path is basically the whole point of the app, so I had to</w:t>
+      </w:r>
+      <w:r>
+        <w:t xml:space="preserve"> </w:t>
+      </w:r>
+      <w:r>
+        <w:t xml:space="preserve">figure out how to do it properly.</w:t>
+      </w:r>
+    </w:p>
+    <w:p>
+      <w:pPr>
+        <w:pStyle w:val="BodyText"/>
+      </w:pPr>
+      <w:r>
+        <w:t xml:space="preserve">And it’s trickier than it sounds. Grabbing the phone’s location once is easy;</w:t>
       </w:r>
       <w:r>
         <w:t xml:space="preserve"> </w:t>
@@ -113,19 +157,19 @@
           <w:i/>
           <w:iCs/>
         </w:rPr>
-        <w:t xml:space="preserve">where the user actually went</w:t>
-      </w:r>
-      <w:r>
-        <w:t xml:space="preserve"> </w:t>
-      </w:r>
-      <w:r>
-        <w:t xml:space="preserve">— fitness trackers, delivery apps,</w:t>
-      </w:r>
-      <w:r>
-        <w:t xml:space="preserve"> </w:t>
-      </w:r>
-      <w:r>
-        <w:t xml:space="preserve">and travel apps all log a GPS trail. Doing this correctly on Android requires two pieces that work</w:t>
+        <w:t xml:space="preserve">continuously</w:t>
+      </w:r>
+      <w:r>
+        <w:t xml:space="preserve"> </w:t>
+      </w:r>
+      <w:r>
+        <w:t xml:space="preserve">logging it</w:t>
+      </w:r>
+      <w:r>
+        <w:t xml:space="preserve"> </w:t>
+      </w:r>
+      <w:r>
+        <w:t xml:space="preserve">while the user is off doing something else is the hard part. You really need two things working</w:t>
       </w:r>
       <w:r>
         <w:t xml:space="preserve"> </w:t>
@@ -145,8 +189,6 @@
       <w:r>
         <w:rPr>
           <w:rStyle w:val="VerbatimChar"/>
-          <w:b/>
-          <w:bCs/>
         </w:rPr>
         <w:t xml:space="preserve">FusedLocationProviderClient</w:t>
       </w:r>
@@ -154,13 +196,7 @@
         <w:t xml:space="preserve"> </w:t>
       </w:r>
       <w:r>
-        <w:t xml:space="preserve">(from Google Play Services Location) — the modern, battery-aware</w:t>
-      </w:r>
-      <w:r>
-        <w:t xml:space="preserve"> </w:t>
-      </w:r>
-      <w:r>
-        <w:t xml:space="preserve">API for receiving a stream of GPS fixes.</w:t>
+        <w:t xml:space="preserve">— the thing that gives you a steady stream of GPS fixes.</w:t>
       </w:r>
     </w:p>
     <w:p>
@@ -172,32 +208,22 @@
         </w:numPr>
       </w:pPr>
       <w:r>
-        <w:rPr>
-          <w:b/>
-          <w:bCs/>
-        </w:rPr>
-        <w:t xml:space="preserve">A Foreground Service</w:t>
-      </w:r>
-      <w:r>
-        <w:t xml:space="preserve"> </w:t>
-      </w:r>
-      <w:r>
-        <w:t xml:space="preserve">— so location keeps being logged while the user is in another app (e.g.</w:t>
-      </w:r>
-      <w:r>
-        <w:t xml:space="preserve"> </w:t>
-      </w:r>
-      <w:r>
-        <w:t xml:space="preserve">navigating in Google Maps), with a persistent notification telling the user recording is active.</w:t>
+        <w:t xml:space="preserve">A foreground service — so the phone keeps logging even after the user leaves your app (in</w:t>
+      </w:r>
+      <w:r>
+        <w:t xml:space="preserve"> </w:t>
+      </w:r>
+      <w:r>
+        <w:t xml:space="preserve">Roamly they’re usually navigating in Google Maps while we quietly record in the background).</w:t>
       </w:r>
     </w:p>
-    <w:bookmarkStart w:id="21" w:name="what-is-this-utility-exactly"/>
+    <w:bookmarkStart w:id="21" w:name="so-whats-the-actual-tool-here"/>
     <w:p>
       <w:pPr>
         <w:pStyle w:val="Heading3"/>
       </w:pPr>
       <w:r>
-        <w:t xml:space="preserve">What is this utility, exactly?</w:t>
+        <w:t xml:space="preserve">So what’s the actual tool here?</w:t>
       </w:r>
     </w:p>
     <w:p>
@@ -207,8 +233,6 @@
       <w:r>
         <w:rPr>
           <w:rStyle w:val="VerbatimChar"/>
-          <w:b/>
-          <w:bCs/>
         </w:rPr>
         <w:t xml:space="preserve">FusedLocationProviderClient</w:t>
       </w:r>
@@ -216,23 +240,13 @@
         <w:t xml:space="preserve"> </w:t>
       </w:r>
       <w:r>
-        <w:t xml:space="preserve">is the location client from the</w:t>
-      </w:r>
-      <w:r>
-        <w:t xml:space="preserve"> </w:t>
-      </w:r>
-      <w:r>
-        <w:rPr>
-          <w:b/>
-          <w:bCs/>
-        </w:rPr>
-        <w:t xml:space="preserve">Google Play Services Location</w:t>
-      </w:r>
-      <w:r>
-        <w:t xml:space="preserve"> </w:t>
-      </w:r>
-      <w:r>
-        <w:t xml:space="preserve">library (</w:t>
+        <w:t xml:space="preserve">lives in Google Play Services Location</w:t>
+      </w:r>
+      <w:r>
+        <w:t xml:space="preserve"> </w:t>
+      </w:r>
+      <w:r>
+        <w:t xml:space="preserve">(</w:t>
       </w:r>
       <w:r>
         <w:rPr>
@@ -241,35 +255,37 @@
         <w:t xml:space="preserve">com.google.android.gms:play-services-location</w:t>
       </w:r>
       <w:r>
-        <w:t xml:space="preserve">). It is called</w:t>
-      </w:r>
-      <w:r>
-        <w:t xml:space="preserve"> </w:t>
-      </w:r>
-      <w:r>
-        <w:rPr>
-          <w:i/>
-          <w:iCs/>
-        </w:rPr>
-        <w:t xml:space="preserve">fused</w:t>
-      </w:r>
-      <w:r>
-        <w:t xml:space="preserve"> </w:t>
-      </w:r>
-      <w:r>
-        <w:t xml:space="preserve">because it</w:t>
-      </w:r>
-      <w:r>
-        <w:t xml:space="preserve"> </w:t>
-      </w:r>
-      <w:r>
-        <w:t xml:space="preserve">transparently blends GPS, Wi-Fi, cell-tower, and motion-sensor signals into a single, smoothed</w:t>
-      </w:r>
-      <w:r>
-        <w:t xml:space="preserve"> </w:t>
-      </w:r>
-      <w:r>
-        <w:t xml:space="preserve">location stream, and it lets you trade accuracy against battery through a declarative</w:t>
+        <w:t xml:space="preserve">). The</w:t>
+      </w:r>
+      <w:r>
+        <w:t xml:space="preserve"> </w:t>
+      </w:r>
+      <w:r>
+        <w:t xml:space="preserve">“fused”</w:t>
+      </w:r>
+      <w:r>
+        <w:t xml:space="preserve"> </w:t>
+      </w:r>
+      <w:r>
+        <w:t xml:space="preserve">bit just means it blends GPS, Wi-Fi,</w:t>
+      </w:r>
+      <w:r>
+        <w:t xml:space="preserve"> </w:t>
+      </w:r>
+      <w:r>
+        <w:t xml:space="preserve">cell towers, and the motion sensors into one clean location stream, and it lets you decide how</w:t>
+      </w:r>
+      <w:r>
+        <w:t xml:space="preserve"> </w:t>
+      </w:r>
+      <w:r>
+        <w:t xml:space="preserve">aggressive to be — how often it updates, how accurate, how far you have to move before it bothers you —</w:t>
+      </w:r>
+      <w:r>
+        <w:t xml:space="preserve"> </w:t>
+      </w:r>
+      <w:r>
+        <w:t xml:space="preserve">through a</w:t>
       </w:r>
       <w:r>
         <w:t xml:space="preserve"> </w:t>
@@ -281,10 +297,7 @@
         <w:t xml:space="preserve">LocationRequest</w:t>
       </w:r>
       <w:r>
-        <w:t xml:space="preserve"> </w:t>
-      </w:r>
-      <w:r>
-        <w:t xml:space="preserve">(update interval, priority, and minimum distance). It replaces the older</w:t>
+        <w:t xml:space="preserve">. It’s what Google points you to these days instead of the old</w:t>
       </w:r>
       <w:r>
         <w:t xml:space="preserve"> </w:t>
@@ -293,13 +306,10 @@
         <w:rPr>
           <w:rStyle w:val="VerbatimChar"/>
         </w:rPr>
-        <w:t xml:space="preserve">android.location.LocationManager</w:t>
-      </w:r>
-      <w:r>
-        <w:t xml:space="preserve"> </w:t>
-      </w:r>
-      <w:r>
-        <w:t xml:space="preserve">and is the approach Google recommends for almost all apps.</w:t>
+        <w:t xml:space="preserve">LocationManager</w:t>
+      </w:r>
+      <w:r>
+        <w:t xml:space="preserve">.</w:t>
       </w:r>
     </w:p>
     <w:p>
@@ -307,23 +317,7 @@
         <w:pStyle w:val="BodyText"/>
       </w:pPr>
       <w:r>
-        <w:t xml:space="preserve">A</w:t>
-      </w:r>
-      <w:r>
-        <w:t xml:space="preserve"> </w:t>
-      </w:r>
-      <w:r>
-        <w:rPr>
-          <w:b/>
-          <w:bCs/>
-        </w:rPr>
-        <w:t xml:space="preserve">Foreground Service</w:t>
-      </w:r>
-      <w:r>
-        <w:t xml:space="preserve"> </w:t>
-      </w:r>
-      <w:r>
-        <w:t xml:space="preserve">is a long-running Android</w:t>
+        <w:t xml:space="preserve">A foreground service is just an Android</w:t>
       </w:r>
       <w:r>
         <w:t xml:space="preserve"> </w:t>
@@ -338,35 +332,19 @@
         <w:t xml:space="preserve"> </w:t>
       </w:r>
       <w:r>
-        <w:t xml:space="preserve">that the operating system keeps alive</w:t>
-      </w:r>
-      <w:r>
-        <w:t xml:space="preserve"> </w:t>
-      </w:r>
-      <w:r>
-        <w:rPr>
-          <w:i/>
-          <w:iCs/>
-        </w:rPr>
-        <w:t xml:space="preserve">because</w:t>
-      </w:r>
-      <w:r>
-        <w:t xml:space="preserve"> </w:t>
-      </w:r>
-      <w:r>
-        <w:t xml:space="preserve">it continuously shows the user an ongoing notification. It is the officially supported way</w:t>
-      </w:r>
-      <w:r>
-        <w:t xml:space="preserve"> </w:t>
-      </w:r>
-      <w:r>
-        <w:t xml:space="preserve">to run user-visible work — such as location logging, music playback, or navigation — when your app is</w:t>
-      </w:r>
-      <w:r>
-        <w:t xml:space="preserve"> </w:t>
-      </w:r>
-      <w:r>
-        <w:t xml:space="preserve">not on screen.</w:t>
+        <w:t xml:space="preserve">that the system promises not to kill, as long as</w:t>
+      </w:r>
+      <w:r>
+        <w:t xml:space="preserve"> </w:t>
+      </w:r>
+      <w:r>
+        <w:t xml:space="preserve">it keeps a notification on screen so the user knows something is running. That’s the sanctioned way to</w:t>
+      </w:r>
+      <w:r>
+        <w:t xml:space="preserve"> </w:t>
+      </w:r>
+      <w:r>
+        <w:t xml:space="preserve">keep doing work — location, music, navigation — when your app isn’t in front.</w:t>
       </w:r>
     </w:p>
     <w:p>
@@ -374,20 +352,7 @@
         <w:pStyle w:val="BodyText"/>
       </w:pPr>
       <w:r>
-        <w:t xml:space="preserve">Why both are needed</w:t>
-      </w:r>
-      <w:r>
-        <w:t xml:space="preserve"> </w:t>
-      </w:r>
-      <w:r>
-        <w:rPr>
-          <w:i/>
-          <w:iCs/>
-        </w:rPr>
-        <w:t xml:space="preserve">together</w:t>
-      </w:r>
-      <w:r>
-        <w:t xml:space="preserve">: on its own,</w:t>
+        <w:t xml:space="preserve">Here’s the catch, and the reason you need both: on its own,</w:t>
       </w:r>
       <w:r>
         <w:t xml:space="preserve"> </w:t>
@@ -402,63 +367,31 @@
         <w:t xml:space="preserve"> </w:t>
       </w:r>
       <w:r>
-        <w:t xml:space="preserve">stops delivering updates</w:t>
-      </w:r>
-      <w:r>
-        <w:t xml:space="preserve"> </w:t>
-      </w:r>
-      <w:r>
-        <w:t xml:space="preserve">once your app is backgrounded (and modern Android increasingly restricts background location). Hosting</w:t>
-      </w:r>
-      <w:r>
-        <w:t xml:space="preserve"> </w:t>
-      </w:r>
-      <w:r>
-        <w:t xml:space="preserve">the location client</w:t>
-      </w:r>
-      <w:r>
-        <w:t xml:space="preserve"> </w:t>
-      </w:r>
-      <w:r>
-        <w:rPr>
-          <w:b/>
-          <w:bCs/>
-        </w:rPr>
-        <w:t xml:space="preserve">inside a Foreground Service</w:t>
-      </w:r>
-      <w:r>
-        <w:t xml:space="preserve"> </w:t>
-      </w:r>
-      <w:r>
-        <w:t xml:space="preserve">is what makes continuous,</w:t>
-      </w:r>
-      <w:r>
-        <w:t xml:space="preserve"> </w:t>
-      </w:r>
-      <w:r>
-        <w:rPr>
-          <w:i/>
-          <w:iCs/>
-        </w:rPr>
-        <w:t xml:space="preserve">background</w:t>
-      </w:r>
-      <w:r>
-        <w:t xml:space="preserve"> </w:t>
-      </w:r>
-      <w:r>
-        <w:t xml:space="preserve">route</w:t>
-      </w:r>
-      <w:r>
-        <w:t xml:space="preserve"> </w:t>
-      </w:r>
-      <w:r>
-        <w:t xml:space="preserve">recording reliable and policy-compliant. That pairing — a fused location stream driven from a</w:t>
-      </w:r>
-      <w:r>
-        <w:t xml:space="preserve"> </w:t>
-      </w:r>
-      <w:r>
-        <w:t xml:space="preserve">foreground service, surfaced to Jetpack Compose — is the utility this tutorial teaches.</w:t>
+        <w:t xml:space="preserve">quietly stops</w:t>
+      </w:r>
+      <w:r>
+        <w:t xml:space="preserve"> </w:t>
+      </w:r>
+      <w:r>
+        <w:t xml:space="preserve">sending updates the second your app goes to the background (and newer Android versions keep tightening</w:t>
+      </w:r>
+      <w:r>
+        <w:t xml:space="preserve"> </w:t>
+      </w:r>
+      <w:r>
+        <w:t xml:space="preserve">this). Drop it inside a Foreground Service and it just keeps going. That combo — a fused location</w:t>
+      </w:r>
+      <w:r>
+        <w:t xml:space="preserve"> </w:t>
+      </w:r>
+      <w:r>
+        <w:t xml:space="preserve">stream running out of a foreground service, piped up into Jetpack Compose — is what this tutorial is</w:t>
+      </w:r>
+      <w:r>
+        <w:t xml:space="preserve"> </w:t>
+      </w:r>
+      <w:r>
+        <w:t xml:space="preserve">about.</w:t>
       </w:r>
     </w:p>
     <w:p>
@@ -466,64 +399,37 @@
         <w:pStyle w:val="BodyText"/>
       </w:pPr>
       <w:r>
-        <w:t xml:space="preserve">This report is a step-by-step tutorial for building exactly that: a feature that, on</w:t>
-      </w:r>
-      <w:r>
-        <w:t xml:space="preserve"> </w:t>
-      </w:r>
-      <w:r>
-        <w:rPr>
-          <w:b/>
-          <w:bCs/>
-        </w:rPr>
-        <w:t xml:space="preserve">Start Trip</w:t>
-      </w:r>
-      <w:r>
-        <w:t xml:space="preserve">,</w:t>
-      </w:r>
-      <w:r>
-        <w:t xml:space="preserve"> </w:t>
-      </w:r>
-      <w:r>
-        <w:t xml:space="preserve">begins logging the device’s GPS path in the background, draws the route live, and saves it when the</w:t>
-      </w:r>
-      <w:r>
-        <w:t xml:space="preserve"> </w:t>
-      </w:r>
-      <w:r>
-        <w:t xml:space="preserve">user taps</w:t>
-      </w:r>
-      <w:r>
-        <w:t xml:space="preserve"> </w:t>
-      </w:r>
-      <w:r>
-        <w:rPr>
-          <w:b/>
-          <w:bCs/>
-        </w:rPr>
-        <w:t xml:space="preserve">Stop Trip</w:t>
-      </w:r>
-      <w:r>
-        <w:t xml:space="preserve">. The working reference is</w:t>
-      </w:r>
-      <w:r>
-        <w:t xml:space="preserve"> </w:t>
-      </w:r>
-      <w:r>
-        <w:rPr>
-          <w:b/>
-          <w:bCs/>
-        </w:rPr>
-        <w:t xml:space="preserve">Roamly</w:t>
-      </w:r>
-      <w:r>
-        <w:t xml:space="preserve">, a travel app where contributing your own</w:t>
-      </w:r>
-      <w:r>
-        <w:t xml:space="preserve"> </w:t>
-      </w:r>
-      <w:r>
-        <w:t xml:space="preserve">recorded routes unlocks recommendations from other travelers.</w:t>
+        <w:t xml:space="preserve">What we’re building: tap</w:t>
+      </w:r>
+      <w:r>
+        <w:t xml:space="preserve"> </w:t>
+      </w:r>
+      <w:r>
+        <w:t xml:space="preserve">“Start Trip”</w:t>
+      </w:r>
+      <w:r>
+        <w:t xml:space="preserve"> </w:t>
+      </w:r>
+      <w:r>
+        <w:t xml:space="preserve">and the app starts logging your GPS path in the background and</w:t>
+      </w:r>
+      <w:r>
+        <w:t xml:space="preserve"> </w:t>
+      </w:r>
+      <w:r>
+        <w:t xml:space="preserve">draws it live; tap</w:t>
+      </w:r>
+      <w:r>
+        <w:t xml:space="preserve"> </w:t>
+      </w:r>
+      <w:r>
+        <w:t xml:space="preserve">“Stop Trip”</w:t>
+      </w:r>
+      <w:r>
+        <w:t xml:space="preserve"> </w:t>
+      </w:r>
+      <w:r>
+        <w:t xml:space="preserve">and it saves the route. All the real code is in Roamly (link above).</w:t>
       </w:r>
     </w:p>
     <w:p>
@@ -531,35 +437,19 @@
         <w:pStyle w:val="BodyText"/>
       </w:pPr>
       <w:r>
-        <w:t xml:space="preserve">The report is organized as: why this utility is</w:t>
-      </w:r>
-      <w:r>
-        <w:t xml:space="preserve"> </w:t>
-      </w:r>
-      <w:r>
-        <w:rPr>
-          <w:i/>
-          <w:iCs/>
-        </w:rPr>
-        <w:t xml:space="preserve">not</w:t>
-      </w:r>
-      <w:r>
-        <w:t xml:space="preserve"> </w:t>
-      </w:r>
-      <w:r>
-        <w:t xml:space="preserve">part of the course (§2), background on the two</w:t>
-      </w:r>
-      <w:r>
-        <w:t xml:space="preserve"> </w:t>
-      </w:r>
-      <w:r>
-        <w:t xml:space="preserve">APIs (§3), prerequisites (§4), a step-by-step implementation with code and screenshots (§5–6), a</w:t>
-      </w:r>
-      <w:r>
-        <w:t xml:space="preserve"> </w:t>
-      </w:r>
-      <w:r>
-        <w:t xml:space="preserve">pointer to the full working app (§7), and a conclusion (§8).</w:t>
+        <w:t xml:space="preserve">The rest of the report covers why this isn’t something the course already taught (§2), a little</w:t>
+      </w:r>
+      <w:r>
+        <w:t xml:space="preserve"> </w:t>
+      </w:r>
+      <w:r>
+        <w:t xml:space="preserve">background on the two APIs (§3), what you need before you start (§4), the actual step-by-step build</w:t>
+      </w:r>
+      <w:r>
+        <w:t xml:space="preserve"> </w:t>
+      </w:r>
+      <w:r>
+        <w:t xml:space="preserve">with code and screenshots (§5–6), where to grab the finished app (§7), and a short wrap-up (§8).</w:t>
       </w:r>
     </w:p>
     <w:p>
@@ -633,89 +523,28 @@
         <w:t xml:space="preserve">LazyColumn</w:t>
       </w:r>
       <w:r>
-        <w:t xml:space="preserve">, and Retrofit networking.</w:t>
-      </w:r>
-      <w:r>
-        <w:t xml:space="preserve"> </w:t>
-      </w:r>
-      <w:r>
-        <w:rPr>
-          <w:b/>
-          <w:bCs/>
-        </w:rPr>
-        <w:t xml:space="preserve">Neither the Google Play Services Location APIs</w:t>
-      </w:r>
-      <w:r>
-        <w:rPr>
-          <w:b/>
-          <w:bCs/>
-        </w:rPr>
-        <w:t xml:space="preserve"> </w:t>
-      </w:r>
-      <w:r>
-        <w:rPr>
-          <w:b/>
-          <w:bCs/>
-        </w:rPr>
-        <w:t xml:space="preserve">(</w:t>
+        <w:t xml:space="preserve">, and Retrofit networking. What none of them touch is location: neither the Google Play</w:t>
+      </w:r>
+      <w:r>
+        <w:t xml:space="preserve"> </w:t>
+      </w:r>
+      <w:r>
+        <w:t xml:space="preserve">Services Location APIs (</w:t>
       </w:r>
       <w:r>
         <w:rPr>
           <w:rStyle w:val="VerbatimChar"/>
-          <w:b/>
-          <w:bCs/>
         </w:rPr>
         <w:t xml:space="preserve">FusedLocationProviderClient</w:t>
       </w:r>
       <w:r>
-        <w:rPr>
-          <w:b/>
-          <w:bCs/>
-        </w:rPr>
-        <w:t xml:space="preserve">) nor Android</w:t>
-      </w:r>
-      <w:r>
-        <w:rPr>
-          <w:b/>
-          <w:bCs/>
-        </w:rPr>
-        <w:t xml:space="preserve"> </w:t>
-      </w:r>
-      <w:r>
-        <w:rPr>
-          <w:rStyle w:val="VerbatimChar"/>
-          <w:b/>
-          <w:bCs/>
-        </w:rPr>
-        <w:t xml:space="preserve">Service</w:t>
-      </w:r>
-      <w:r>
-        <w:rPr>
-          <w:b/>
-          <w:bCs/>
-        </w:rPr>
-        <w:t xml:space="preserve"> </w:t>
-      </w:r>
-      <w:r>
-        <w:rPr>
-          <w:b/>
-          <w:bCs/>
-        </w:rPr>
-        <w:t xml:space="preserve">/ Foreground Services appear anywhere in the</w:t>
-      </w:r>
-      <w:r>
-        <w:rPr>
-          <w:b/>
-          <w:bCs/>
-        </w:rPr>
-        <w:t xml:space="preserve"> </w:t>
-      </w:r>
-      <w:r>
-        <w:rPr>
-          <w:b/>
-          <w:bCs/>
-        </w:rPr>
-        <w:t xml:space="preserve">course.</w:t>
+        <w:t xml:space="preserve">) nor Android Services / foreground services show</w:t>
+      </w:r>
+      <w:r>
+        <w:t xml:space="preserve"> </w:t>
+      </w:r>
+      <w:r>
+        <w:t xml:space="preserve">up anywhere in the course.</w:t>
       </w:r>
     </w:p>
     <w:tbl>
@@ -797,33 +626,7 @@
               <w:pStyle w:val="Compact"/>
             </w:pPr>
             <w:r>
-              <w:t xml:space="preserve">ViewModel, StateFlow,</w:t>
-            </w:r>
-            <w:r>
-              <w:t xml:space="preserve"> </w:t>
-            </w:r>
-            <w:r>
-              <w:rPr>
-                <w:b/>
-                <w:bCs/>
-              </w:rPr>
-              <w:t xml:space="preserve">Notifications</w:t>
-            </w:r>
-            <w:r>
-              <w:t xml:space="preserve">,</w:t>
-            </w:r>
-            <w:r>
-              <w:t xml:space="preserve"> </w:t>
-            </w:r>
-            <w:r>
-              <w:rPr>
-                <w:b/>
-                <w:bCs/>
-              </w:rPr>
-              <w:t xml:space="preserve">runtime permissions</w:t>
-            </w:r>
-            <w:r>
-              <w:t xml:space="preserve">, BroadcastReceiver</w:t>
+              <w:t xml:space="preserve">ViewModel, StateFlow, Notifications, runtime permissions, BroadcastReceiver</w:t>
             </w:r>
           </w:p>
         </w:tc>
@@ -864,20 +667,7 @@
               <w:t xml:space="preserve"> </w:t>
             </w:r>
             <w:r>
-              <w:t xml:space="preserve">— but only for</w:t>
-            </w:r>
-            <w:r>
-              <w:t xml:space="preserve"> </w:t>
-            </w:r>
-            <w:r>
-              <w:rPr>
-                <w:i/>
-                <w:iCs/>
-              </w:rPr>
-              <w:t xml:space="preserve">status-bar alerts</w:t>
-            </w:r>
-            <w:r>
-              <w:t xml:space="preserve">, never tied to a Service or to location</w:t>
+              <w:t xml:space="preserve">— but only for status-bar alerts, never tied to a Service or to location</w:t>
             </w:r>
           </w:p>
         </w:tc>
@@ -938,97 +728,43 @@
         <w:pStyle w:val="BodyText"/>
       </w:pPr>
       <w:r>
-        <w:t xml:space="preserve">So while this tutorial</w:t>
-      </w:r>
-      <w:r>
-        <w:t xml:space="preserve"> </w:t>
-      </w:r>
-      <w:r>
-        <w:rPr>
-          <w:i/>
-          <w:iCs/>
-        </w:rPr>
-        <w:t xml:space="preserve">reuses</w:t>
-      </w:r>
-      <w:r>
-        <w:t xml:space="preserve"> </w:t>
-      </w:r>
-      <w:r>
-        <w:t xml:space="preserve">two course building blocks (a runtime-permission request and a</w:t>
-      </w:r>
-      <w:r>
-        <w:t xml:space="preserve"> </w:t>
-      </w:r>
-      <w:r>
-        <w:t xml:space="preserve">notification channel), its</w:t>
-      </w:r>
-      <w:r>
-        <w:t xml:space="preserve"> </w:t>
-      </w:r>
-      <w:r>
-        <w:rPr>
-          <w:b/>
-          <w:bCs/>
-        </w:rPr>
-        <w:t xml:space="preserve">novel core — receiving GPS updates with</w:t>
-      </w:r>
-      <w:r>
-        <w:rPr>
-          <w:b/>
-          <w:bCs/>
-        </w:rPr>
+        <w:t xml:space="preserve">So yes, this tutorial leans on two things the course did teach (asking for a runtime permission and</w:t>
+      </w:r>
+      <w:r>
+        <w:t xml:space="preserve"> </w:t>
+      </w:r>
+      <w:r>
+        <w:t xml:space="preserve">making a notification channel), but the actual meat of it — pulling GPS updates from</w:t>
+      </w:r>
+      <w:r>
         <w:t xml:space="preserve"> </w:t>
       </w:r>
       <w:r>
         <w:rPr>
           <w:rStyle w:val="VerbatimChar"/>
-          <w:b/>
-          <w:bCs/>
         </w:rPr>
         <w:t xml:space="preserve">FusedLocationProviderClient</w:t>
       </w:r>
       <w:r>
-        <w:rPr>
-          <w:b/>
-          <w:bCs/>
-        </w:rPr>
-        <w:t xml:space="preserve"> </w:t>
-      </w:r>
-      <w:r>
-        <w:rPr>
-          <w:b/>
-          <w:bCs/>
-        </w:rPr>
+        <w:t xml:space="preserve"> </w:t>
+      </w:r>
+      <w:r>
         <w:t xml:space="preserve">inside a</w:t>
       </w:r>
       <w:r>
-        <w:rPr>
-          <w:b/>
-          <w:bCs/>
-        </w:rPr>
         <w:t xml:space="preserve"> </w:t>
       </w:r>
       <w:r>
         <w:rPr>
           <w:rStyle w:val="VerbatimChar"/>
-          <w:b/>
-          <w:bCs/>
         </w:rPr>
         <w:t xml:space="preserve">Service</w:t>
       </w:r>
       <w:r>
-        <w:rPr>
-          <w:b/>
-          <w:bCs/>
-        </w:rPr>
-        <w:t xml:space="preserve"> </w:t>
-      </w:r>
-      <w:r>
-        <w:rPr>
-          <w:b/>
-          <w:bCs/>
-        </w:rPr>
-        <w:t xml:space="preserve">that runs in the foreground — is entirely new material.</w:t>
+        <w:t xml:space="preserve"> </w:t>
+      </w:r>
+      <w:r>
+        <w:t xml:space="preserve">that runs in the foreground — is all new ground.</w:t>
       </w:r>
     </w:p>
     <w:p>
@@ -1055,8 +791,6 @@
       <w:r>
         <w:rPr>
           <w:rStyle w:val="VerbatimChar"/>
-          <w:b/>
-          <w:bCs/>
         </w:rPr>
         <w:t xml:space="preserve">FusedLocationProviderClient</w:t>
       </w:r>
@@ -1126,17 +860,7 @@
         <w:pStyle w:val="BodyText"/>
       </w:pPr>
       <w:r>
-        <w:rPr>
-          <w:b/>
-          <w:bCs/>
-        </w:rPr>
-        <w:t xml:space="preserve">A Foreground Service</w:t>
-      </w:r>
-      <w:r>
-        <w:t xml:space="preserve"> </w:t>
-      </w:r>
-      <w:r>
-        <w:t xml:space="preserve">is an Android</w:t>
+        <w:t xml:space="preserve">A foreground service is an Android</w:t>
       </w:r>
       <w:r>
         <w:t xml:space="preserve"> </w:t>
@@ -1175,13 +899,19 @@
         <w:t xml:space="preserve">startForeground(...)</w:t>
       </w:r>
       <w:r>
-        <w:t xml:space="preserve">, which requires an ongoing notification. The OS treats it as user-visible work</w:t>
-      </w:r>
-      <w:r>
-        <w:t xml:space="preserve"> </w:t>
-      </w:r>
-      <w:r>
-        <w:t xml:space="preserve">and won’t casually kill it — essential for continuous location logging while the user is elsewhere.</w:t>
+        <w:t xml:space="preserve">,</w:t>
+      </w:r>
+      <w:r>
+        <w:t xml:space="preserve"> </w:t>
+      </w:r>
+      <w:r>
+        <w:t xml:space="preserve">which requires an ongoing notification. The OS treats it as user-visible work and won’t casually kill</w:t>
+      </w:r>
+      <w:r>
+        <w:t xml:space="preserve"> </w:t>
+      </w:r>
+      <w:r>
+        <w:t xml:space="preserve">it — which is exactly what you want for logging location while the user is off in another app.</w:t>
       </w:r>
     </w:p>
     <w:p>
@@ -1254,20 +984,7 @@
         </w:numPr>
       </w:pPr>
       <w:r>
-        <w:t xml:space="preserve">Android Studio (recent stable), a device/emulator on</w:t>
-      </w:r>
-      <w:r>
-        <w:t xml:space="preserve"> </w:t>
-      </w:r>
-      <w:r>
-        <w:rPr>
-          <w:b/>
-          <w:bCs/>
-        </w:rPr>
-        <w:t xml:space="preserve">API 28+</w:t>
-      </w:r>
-      <w:r>
-        <w:t xml:space="preserve">.</w:t>
+        <w:t xml:space="preserve">Android Studio (recent stable), a device/emulator on API 28+.</w:t>
       </w:r>
     </w:p>
     <w:p>
@@ -1297,11 +1014,7 @@
         <w:t xml:space="preserve"> </w:t>
       </w:r>
       <w:r>
-        <w:rPr>
-          <w:b/>
-          <w:bCs/>
-        </w:rPr>
-        <w:t xml:space="preserve">Extended Controls → Location</w:t>
+        <w:t xml:space="preserve">“Extended Controls → Location”</w:t>
       </w:r>
       <w:r>
         <w:t xml:space="preserve"> </w:t>
@@ -9878,11 +9591,7 @@
         <w:t xml:space="preserve"> </w:t>
       </w:r>
       <w:r>
-        <w:rPr>
-          <w:b/>
-          <w:bCs/>
-        </w:rPr>
-        <w:t xml:space="preserve">Start Trip</w:t>
+        <w:t xml:space="preserve">“Start Trip”</w:t>
       </w:r>
       <w:r>
         <w:t xml:space="preserve"> </w:t>
@@ -9924,11 +9633,7 @@
         <w:t xml:space="preserve"> </w:t>
       </w:r>
       <w:r>
-        <w:rPr>
-          <w:b/>
-          <w:bCs/>
-        </w:rPr>
-        <w:t xml:space="preserve">Stop Trip</w:t>
+        <w:t xml:space="preserve">“Stop Trip”</w:t>
       </w:r>
       <w:r>
         <w:t xml:space="preserve"> </w:t>
@@ -10083,85 +9788,43 @@
         <w:pStyle w:val="BlockText"/>
       </w:pPr>
       <w:r>
-        <w:rPr>
-          <w:b/>
-          <w:bCs/>
-        </w:rPr>
-        <w:t xml:space="preserve">Note on the map visuals.</w:t>
-      </w:r>
-      <w:r>
-        <w:t xml:space="preserve"> </w:t>
-      </w:r>
-      <w:r>
-        <w:t xml:space="preserve">The route in these screenshots is rendered on a</w:t>
-      </w:r>
-      <w:r>
-        <w:t xml:space="preserve"> </w:t>
-      </w:r>
-      <w:r>
-        <w:rPr>
-          <w:b/>
-          <w:bCs/>
-        </w:rPr>
-        <w:t xml:space="preserve">Compose</w:t>
-      </w:r>
-      <w:r>
-        <w:rPr>
-          <w:b/>
-          <w:bCs/>
-        </w:rPr>
+        <w:t xml:space="preserve">A quick heads-up on the map: the route in these screenshots is drawn on a Compose</w:t>
+      </w:r>
+      <w:r>
         <w:t xml:space="preserve"> </w:t>
       </w:r>
       <w:r>
         <w:rPr>
           <w:rStyle w:val="VerbatimChar"/>
-          <w:b/>
-          <w:bCs/>
         </w:rPr>
         <w:t xml:space="preserve">Canvas</w:t>
       </w:r>
       <w:r>
-        <w:t xml:space="preserve">,</w:t>
-      </w:r>
-      <w:r>
-        <w:t xml:space="preserve"> </w:t>
-      </w:r>
-      <w:r>
-        <w:t xml:space="preserve">not on a Google Map. This is a deliberate choice: the Google Maps SDK requires a Google Cloud API</w:t>
-      </w:r>
-      <w:r>
-        <w:t xml:space="preserve"> </w:t>
-      </w:r>
-      <w:r>
-        <w:t xml:space="preserve">key and an attached</w:t>
-      </w:r>
-      <w:r>
-        <w:t xml:space="preserve"> </w:t>
-      </w:r>
-      <w:r>
-        <w:rPr>
-          <w:b/>
-          <w:bCs/>
-        </w:rPr>
-        <w:t xml:space="preserve">billing account</w:t>
-      </w:r>
-      <w:r>
-        <w:t xml:space="preserve"> </w:t>
-      </w:r>
-      <w:r>
-        <w:t xml:space="preserve">(Maps usage is billed even within its free monthly credit),</w:t>
-      </w:r>
-      <w:r>
-        <w:t xml:space="preserve"> </w:t>
-      </w:r>
-      <w:r>
-        <w:t xml:space="preserve">which this project avoids to stay entirely on free tiers. The tutorial’s actual subject — the</w:t>
-      </w:r>
-      <w:r>
-        <w:t xml:space="preserve"> </w:t>
-      </w:r>
-      <w:r>
-        <w:t xml:space="preserve">Foreground Service capturing GPS fixes with</w:t>
+        <w:t xml:space="preserve">, not an</w:t>
+      </w:r>
+      <w:r>
+        <w:t xml:space="preserve"> </w:t>
+      </w:r>
+      <w:r>
+        <w:t xml:space="preserve">actual Google Map. That’s on purpose. The Google Maps SDK needs a Google Cloud API key and a billing</w:t>
+      </w:r>
+      <w:r>
+        <w:t xml:space="preserve"> </w:t>
+      </w:r>
+      <w:r>
+        <w:t xml:space="preserve">account — Maps gets billed even inside its free monthly credit — and I wanted to keep the whole</w:t>
+      </w:r>
+      <w:r>
+        <w:t xml:space="preserve"> </w:t>
+      </w:r>
+      <w:r>
+        <w:t xml:space="preserve">project on free tiers. It doesn’t change what the tutorial is really about: the foreground service is</w:t>
+      </w:r>
+      <w:r>
+        <w:t xml:space="preserve"> </w:t>
+      </w:r>
+      <w:r>
+        <w:t xml:space="preserve">still pulling real GPS fixes from</w:t>
       </w:r>
       <w:r>
         <w:t xml:space="preserve"> </w:t>
@@ -10176,66 +9839,31 @@
         <w:t xml:space="preserve"> </w:t>
       </w:r>
       <w:r>
-        <w:t xml:space="preserve">— is unchanged by this</w:t>
-      </w:r>
-      <w:r>
-        <w:t xml:space="preserve"> </w:t>
-      </w:r>
-      <w:r>
-        <w:t xml:space="preserve">choice: it records the</w:t>
-      </w:r>
-      <w:r>
-        <w:t xml:space="preserve"> </w:t>
-      </w:r>
-      <w:r>
-        <w:rPr>
-          <w:b/>
-          <w:bCs/>
-        </w:rPr>
-        <w:t xml:space="preserve">same latitude/longitude points</w:t>
-      </w:r>
-      <w:r>
-        <w:t xml:space="preserve"> </w:t>
-      </w:r>
-      <w:r>
-        <w:t xml:space="preserve">regardless of how they’re displayed. In a</w:t>
-      </w:r>
-      <w:r>
-        <w:t xml:space="preserve"> </w:t>
-      </w:r>
-      <w:r>
-        <w:t xml:space="preserve">production build you would keep all of this code as-is and simply render the recorded points as a</w:t>
-      </w:r>
-      <w:r>
-        <w:t xml:space="preserve"> </w:t>
-      </w:r>
-      <w:r>
-        <w:rPr>
-          <w:b/>
-          <w:bCs/>
-        </w:rPr>
-        <w:t xml:space="preserve">Google Maps</w:t>
-      </w:r>
-      <w:r>
-        <w:rPr>
-          <w:b/>
-          <w:bCs/>
-        </w:rPr>
+        <w:t xml:space="preserve">and recording the same lat/lng points,</w:t>
+      </w:r>
+      <w:r>
+        <w:t xml:space="preserve"> </w:t>
+      </w:r>
+      <w:r>
+        <w:t xml:space="preserve">they’re just getting drawn by hand. In a real release you’d keep all of this code and swap the Canvas</w:t>
+      </w:r>
+      <w:r>
+        <w:t xml:space="preserve"> </w:t>
+      </w:r>
+      <w:r>
+        <w:t xml:space="preserve">for a Google Maps</w:t>
+      </w:r>
+      <w:r>
         <w:t xml:space="preserve"> </w:t>
       </w:r>
       <w:r>
         <w:rPr>
           <w:rStyle w:val="VerbatimChar"/>
-          <w:b/>
-          <w:bCs/>
         </w:rPr>
         <w:t xml:space="preserve">Polyline</w:t>
       </w:r>
       <w:r>
-        <w:t xml:space="preserve"> </w:t>
-      </w:r>
-      <w:r>
-        <w:t xml:space="preserve">on a real basemap (streets, labels, satellite) instead of the Canvas.</w:t>
+        <w:t xml:space="preserve">, so you’d get real streets and labels underneath the route.</w:t>
       </w:r>
     </w:p>
     <w:p>
@@ -10260,20 +9888,7 @@
         <w:pStyle w:val="FirstParagraph"/>
       </w:pPr>
       <w:r>
-        <w:t xml:space="preserve">The complete, runnable implementation is in</w:t>
-      </w:r>
-      <w:r>
-        <w:t xml:space="preserve"> </w:t>
-      </w:r>
-      <w:r>
-        <w:rPr>
-          <w:b/>
-          <w:bCs/>
-        </w:rPr>
-        <w:t xml:space="preserve">Roamly</w:t>
-      </w:r>
-      <w:r>
-        <w:t xml:space="preserve">:</w:t>
+        <w:t xml:space="preserve">The complete, runnable implementation is in Roamly:</w:t>
       </w:r>
       <w:r>
         <w:t xml:space="preserve"> </w:t>
@@ -10622,13 +10237,13 @@
         <w:pStyle w:val="FirstParagraph"/>
       </w:pPr>
       <w:r>
-        <w:t xml:space="preserve">This tutorial showed how to record a GPS route in the background by combining two technologies that</w:t>
-      </w:r>
-      <w:r>
-        <w:t xml:space="preserve"> </w:t>
-      </w:r>
-      <w:r>
-        <w:t xml:space="preserve">the course does not cover:</w:t>
+        <w:t xml:space="preserve">So that’s the whole thing: recording a GPS route in the background by pairing two pieces the course</w:t>
+      </w:r>
+      <w:r>
+        <w:t xml:space="preserve"> </w:t>
+      </w:r>
+      <w:r>
+        <w:t xml:space="preserve">never touched —</w:t>
       </w:r>
       <w:r>
         <w:t xml:space="preserve"> </w:t>
@@ -10636,8 +10251,6 @@
       <w:r>
         <w:rPr>
           <w:rStyle w:val="VerbatimChar"/>
-          <w:b/>
-          <w:bCs/>
         </w:rPr>
         <w:t xml:space="preserve">FusedLocationProviderClient</w:t>
       </w:r>
@@ -10645,29 +10258,25 @@
         <w:t xml:space="preserve"> </w:t>
       </w:r>
       <w:r>
-        <w:t xml:space="preserve">for a battery-aware location stream and a</w:t>
-      </w:r>
-      <w:r>
-        <w:t xml:space="preserve"> </w:t>
-      </w:r>
-      <w:r>
-        <w:rPr>
-          <w:b/>
-          <w:bCs/>
-        </w:rPr>
-        <w:t xml:space="preserve">Foreground Service</w:t>
-      </w:r>
-      <w:r>
-        <w:t xml:space="preserve"> </w:t>
-      </w:r>
-      <w:r>
-        <w:t xml:space="preserve">for continuous, user-visible logging. The key design idea is decoupling the</w:t>
-      </w:r>
-      <w:r>
-        <w:t xml:space="preserve"> </w:t>
-      </w:r>
-      <w:r>
-        <w:t xml:space="preserve">Service from the UI through a process-wide</w:t>
+        <w:t xml:space="preserve">for a battery-friendly location stream, and a foreground</w:t>
+      </w:r>
+      <w:r>
+        <w:t xml:space="preserve"> </w:t>
+      </w:r>
+      <w:r>
+        <w:t xml:space="preserve">service to keep it running when the app isn’t on screen. If there’s one idea worth taking away, it’s</w:t>
+      </w:r>
+      <w:r>
+        <w:t xml:space="preserve"> </w:t>
+      </w:r>
+      <w:r>
+        <w:t xml:space="preserve">the decoupling: the service and the UI never talk to each other directly. They both go through one</w:t>
+      </w:r>
+      <w:r>
+        <w:t xml:space="preserve"> </w:t>
+      </w:r>
+      <w:r>
+        <w:t xml:space="preserve">process-wide</w:t>
       </w:r>
       <w:r>
         <w:t xml:space="preserve"> </w:t>
@@ -10691,58 +10300,42 @@
         <w:t xml:space="preserve">TripSession</w:t>
       </w:r>
       <w:r>
-        <w:t xml:space="preserve">), which lets the recorded route</w:t>
-      </w:r>
-      <w:r>
-        <w:t xml:space="preserve"> </w:t>
-      </w:r>
-      <w:r>
-        <w:t xml:space="preserve">flow cleanly into a ViewModel and a Compose</w:t>
-      </w:r>
-      <w:r>
-        <w:t xml:space="preserve"> </w:t>
-      </w:r>
-      <w:r>
-        <w:rPr>
-          <w:rStyle w:val="VerbatimChar"/>
-        </w:rPr>
-        <w:t xml:space="preserve">Canvas</w:t>
-      </w:r>
-      <w:r>
-        <w:t xml:space="preserve">. The result — a live, drawable, persistable</w:t>
-      </w:r>
-      <w:r>
-        <w:t xml:space="preserve"> </w:t>
-      </w:r>
-      <w:r>
-        <w:t xml:space="preserve">route — is the sensing backbone of Roamly’s</w:t>
-      </w:r>
-      <w:r>
-        <w:t xml:space="preserve"> </w:t>
-      </w:r>
-      <w:r>
-        <w:t xml:space="preserve">“contribute a trip to unlock recommendations”</w:t>
-      </w:r>
-      <w:r>
-        <w:t xml:space="preserve"> </w:t>
-      </w:r>
-      <w:r>
-        <w:t xml:space="preserve">model, and</w:t>
-      </w:r>
-      <w:r>
-        <w:t xml:space="preserve"> </w:t>
-      </w:r>
-      <w:r>
-        <w:t xml:space="preserve">the same pattern applies to any fitness, delivery, or navigation app that needs to answer the question</w:t>
-      </w:r>
-      <w:r>
-        <w:t xml:space="preserve"> </w:t>
-      </w:r>
-      <w:r>
-        <w:rPr>
-          <w:i/>
-          <w:iCs/>
-        </w:rPr>
+        <w:t xml:space="preserve">), and that’s what lets the route flow cleanly into a ViewModel</w:t>
+      </w:r>
+      <w:r>
+        <w:t xml:space="preserve"> </w:t>
+      </w:r>
+      <w:r>
+        <w:t xml:space="preserve">and onto the screen. It’s the sensing backbone of Roamly’s whole</w:t>
+      </w:r>
+      <w:r>
+        <w:t xml:space="preserve"> </w:t>
+      </w:r>
+      <w:r>
+        <w:t xml:space="preserve">“contribute a trip to unlock</w:t>
+      </w:r>
+      <w:r>
+        <w:t xml:space="preserve"> </w:t>
+      </w:r>
+      <w:r>
+        <w:t xml:space="preserve">recommendations”</w:t>
+      </w:r>
+      <w:r>
+        <w:t xml:space="preserve"> </w:t>
+      </w:r>
+      <w:r>
+        <w:t xml:space="preserve">idea, and the same setup works for pretty much any app — fitness, delivery,</w:t>
+      </w:r>
+      <w:r>
+        <w:t xml:space="preserve"> </w:t>
+      </w:r>
+      <w:r>
+        <w:t xml:space="preserve">navigation — that needs to answer</w:t>
+      </w:r>
+      <w:r>
+        <w:t xml:space="preserve"> </w:t>
+      </w:r>
+      <w:r>
         <w:t xml:space="preserve">“where did the user actually go?”</w:t>
       </w:r>
     </w:p>

</xml_diff>